<commit_message>
Add 2 files via upload
</commit_message>
<xml_diff>
--- a/docs/diagrams/Use-case detail-scenario/SS3/UC_SS3_Phạm Tiến Đạt.docx
+++ b/docs/diagrams/Use-case detail-scenario/SS3/UC_SS3_Phạm Tiến Đạt.docx
@@ -357,60 +357,52 @@
             <w:tcW w:w="2293" w:type="dxa"/>
           </w:tcPr>
           <w:p>
+            <w:r>
+              <w:rPr>
+                <w:lang w:val="en-US"/>
+              </w:rPr>
+              <w:t>09</w:t>
+            </w:r>
+            <w:r>
+              <w:t>:00 18/09/2026</w:t>
+            </w:r>
+          </w:p>
+        </w:tc>
+        <w:tc>
+          <w:tcPr>
+            <w:tcW w:w="2294" w:type="dxa"/>
+          </w:tcPr>
+          <w:p>
+            <w:r>
+              <w:rPr>
+                <w:lang w:val="en-US"/>
+              </w:rPr>
+              <w:t>D</w:t>
+            </w:r>
+            <w:r>
+              <w:t>ate Last Updated:</w:t>
+            </w:r>
+          </w:p>
+          <w:p/>
+        </w:tc>
+        <w:tc>
+          <w:tcPr>
+            <w:tcW w:w="2294" w:type="dxa"/>
+          </w:tcPr>
+          <w:p>
             <w:pPr>
               <w:rPr>
                 <w:lang w:val="en-US"/>
               </w:rPr>
             </w:pPr>
-          </w:p>
-        </w:tc>
-        <w:tc>
-          <w:tcPr>
-            <w:tcW w:w="2294" w:type="dxa"/>
-          </w:tcPr>
-          <w:p>
-            <w:r>
-              <w:rPr>
-                <w:lang w:val="en-US"/>
-              </w:rPr>
-              <w:t>D</w:t>
-            </w:r>
-            <w:r>
-              <w:t>ate Last Updated:</w:t>
-            </w:r>
-          </w:p>
-          <w:p/>
-        </w:tc>
-        <w:tc>
-          <w:tcPr>
-            <w:tcW w:w="2294" w:type="dxa"/>
-          </w:tcPr>
-          <w:p>
-            <w:pPr>
-              <w:rPr>
-                <w:lang w:val="en-US"/>
-              </w:rPr>
-            </w:pPr>
-            <w:r>
-              <w:rPr>
-                <w:lang w:val="en-US"/>
-              </w:rPr>
-              <w:t>09</w:t>
-            </w:r>
-            <w:r>
-              <w:t>:</w:t>
-            </w:r>
-            <w:r>
-              <w:t>00</w:t>
-            </w:r>
-            <w:r>
-              <w:t xml:space="preserve"> </w:t>
-            </w:r>
-            <w:r>
-              <w:rPr>
-                <w:lang w:val="en-US"/>
-              </w:rPr>
-              <w:t>18</w:t>
+            <w:r>
+              <w:t>19</w:t>
+            </w:r>
+            <w:r>
+              <w:t xml:space="preserve">:00 </w:t>
+            </w:r>
+            <w:r>
+              <w:t>22</w:t>
             </w:r>
             <w:r>
               <w:t>/09/2026</w:t>
@@ -457,7 +449,13 @@
               <w:t>Nhân viên giám sát trung tâm</w:t>
             </w:r>
             <w:r>
-              <w:t xml:space="preserve"> (Hub Operator).</w:t>
+              <w:t xml:space="preserve"> (Hub Operator)</w:t>
+            </w:r>
+            <w:r>
+              <w:t>, Quản trị viên (Admin)</w:t>
+            </w:r>
+            <w:r>
+              <w:t>.</w:t>
             </w:r>
           </w:p>
           <w:p>
@@ -508,7 +506,18 @@
               </w:rPr>
             </w:pPr>
             <w:r>
+              <w:t xml:space="preserve">1. </w:t>
+            </w:r>
+            <w:r>
               <w:t>Nhân viên giám sát truy cập dashboard tổng quan để theo dõi các chỉ số vận hành thời gian thực bao gồm số lượng xe hiện diện, mức độ lấp đầy (slot khả dụng), doanh thu tạm tính và kiểm tra tình trạng lỗi/hoạt động của các cảm biến IoT tại Hub.</w:t>
+            </w:r>
+          </w:p>
+          <w:p>
+            <w:r>
+              <w:t xml:space="preserve">2. </w:t>
+            </w:r>
+            <w:r>
+              <w:t>Quản trị viên (Admin) có thêm quyền xem dữ liệu doanh thu tổng hợp và thực hiện cấu hình các ngưỡng cảnh báo (theo quy định tại US-07 và US-13b).</w:t>
             </w:r>
           </w:p>
         </w:tc>
@@ -568,7 +577,22 @@
               <w:rPr>
                 <w:lang w:val="en-US"/>
               </w:rPr>
-              <w:t>1. Operator/Kỹ thuật viên đã đăng nhập thành công vào hệ thống với quyền hạn hợp lệ.</w:t>
+              <w:t>1. Operator/</w:t>
+            </w:r>
+            <w:r>
+              <w:rPr>
+                <w:lang w:val="en-US"/>
+              </w:rPr>
+              <w:t>Admin</w:t>
+            </w:r>
+            <w:r>
+              <w:t>/</w:t>
+            </w:r>
+            <w:r>
+              <w:rPr>
+                <w:lang w:val="en-US"/>
+              </w:rPr>
+              <w:t>Kỹ thuật viên đã đăng nhập thành công vào hệ thống với quyền hạn hợp lệ.</w:t>
             </w:r>
           </w:p>
           <w:p>
@@ -612,13 +636,7 @@
           </w:p>
           <w:p>
             <w:r>
-              <w:t xml:space="preserve">2. Các </w:t>
-            </w:r>
-            <w:r>
-              <w:t>cảnh</w:t>
-            </w:r>
-            <w:r>
-              <w:t xml:space="preserve"> báo lỗi (nếu có) được ghi nhận và đưa vào tiến trình xử lý.</w:t>
+              <w:t>2. Các cảnh báo lỗi (nếu có) được ghi nhận và đưa vào tiến trình xử lý.</w:t>
             </w:r>
           </w:p>
         </w:tc>
@@ -638,6 +656,7 @@
               </w:rPr>
             </w:pPr>
             <w:r>
+              <w:lastRenderedPageBreak/>
               <w:t>Normal Flow:</w:t>
             </w:r>
           </w:p>
@@ -652,7 +671,16 @@
               <w:rPr>
                 <w:lang w:val="en-US"/>
               </w:rPr>
-              <w:t>1. Operator truy cập tab "Dashboard Giám sát" trên giao diện phân hệ SS3.</w:t>
+              <w:t>1. Operator</w:t>
+            </w:r>
+            <w:r>
+              <w:t xml:space="preserve"> hoặc admin</w:t>
+            </w:r>
+            <w:r>
+              <w:rPr>
+                <w:lang w:val="en-US"/>
+              </w:rPr>
+              <w:t xml:space="preserve"> truy cập tab "Dashboard Giám sát" trên giao diện phân hệ SS3.</w:t>
             </w:r>
           </w:p>
           <w:p>
@@ -671,13 +699,24 @@
           </w:p>
           <w:p>
             <w:r>
-              <w:lastRenderedPageBreak/>
               <w:t>3. Hệ thống trả về trang tổng quan (Dashboard) hiển thị: tổng số lượng xe đang hoạt động, tỷ lệ lấp đầy tại từng Hub, và doanh thu tạm tính (theo VNĐ).</w:t>
             </w:r>
-          </w:p>
-          <w:p>
-            <w:r>
-              <w:t>4. Operator quan sát các chỉ số liên tục được cập nhật theo thời gian thực.</w:t>
+            <w:r>
+              <w:t xml:space="preserve"> </w:t>
+            </w:r>
+            <w:r>
+              <w:t>Đối với tài khoản Admin, hệ thống hiển thị bổ sung doanh thu tổng hợp và cung cấp công cụ cấu hình ngưỡng cảnh báo.</w:t>
+            </w:r>
+          </w:p>
+          <w:p>
+            <w:r>
+              <w:t xml:space="preserve">4. </w:t>
+            </w:r>
+            <w:r>
+              <w:t>Operator/Admin</w:t>
+            </w:r>
+            <w:r>
+              <w:t xml:space="preserve"> quan sát các chỉ số liên tục được cập nhật theo thời gian thực.</w:t>
             </w:r>
           </w:p>
           <w:p>
@@ -692,10 +731,7 @@
           </w:p>
           <w:p>
             <w:r>
-              <w:t xml:space="preserve">7. Kỹ thuật viên ghi nhận thông tin (vị trí Hub, loại cảm biến) và lên phương án khắc phục bảo </w:t>
-            </w:r>
-            <w:r>
-              <w:t>trì</w:t>
+              <w:t>7. Kỹ thuật viên ghi nhận thông tin (vị trí Hub, loại cảm biến) và lên phương án khắc phục bảo trì</w:t>
             </w:r>
             <w:r>
               <w:t>.</w:t>
@@ -718,7 +754,6 @@
               </w:rPr>
             </w:pPr>
             <w:r>
-              <w:lastRenderedPageBreak/>
               <w:t>Alternative Flows:</w:t>
             </w:r>
           </w:p>
@@ -1001,11 +1036,36 @@
             <w:tcW w:w="2293" w:type="dxa"/>
           </w:tcPr>
           <w:p>
+            <w:r>
+              <w:rPr>
+                <w:lang w:val="en-US"/>
+              </w:rPr>
+              <w:t>09</w:t>
+            </w:r>
+            <w:r>
+              <w:t>:30 18/09/2026</w:t>
+            </w:r>
+          </w:p>
+        </w:tc>
+        <w:tc>
+          <w:tcPr>
+            <w:tcW w:w="2294" w:type="dxa"/>
+          </w:tcPr>
+          <w:p>
             <w:pPr>
               <w:rPr>
                 <w:lang w:val="en-US"/>
               </w:rPr>
             </w:pPr>
+            <w:r>
+              <w:rPr>
+                <w:lang w:val="en-US"/>
+              </w:rPr>
+              <w:t>D</w:t>
+            </w:r>
+            <w:r>
+              <w:t>ate Last Updated:</w:t>
+            </w:r>
           </w:p>
         </w:tc>
         <w:tc>
@@ -1013,29 +1073,8 @@
             <w:tcW w:w="2294" w:type="dxa"/>
           </w:tcPr>
           <w:p>
-            <w:pPr>
-              <w:rPr>
-                <w:lang w:val="en-US"/>
-              </w:rPr>
-            </w:pPr>
-            <w:r>
-              <w:rPr>
-                <w:lang w:val="en-US"/>
-              </w:rPr>
-              <w:t>D</w:t>
-            </w:r>
-            <w:r>
-              <w:t>ate Last Updated:</w:t>
-            </w:r>
-          </w:p>
-        </w:tc>
-        <w:tc>
-          <w:tcPr>
-            <w:tcW w:w="2294" w:type="dxa"/>
-          </w:tcPr>
-          <w:p>
-            <w:r>
-              <w:t>0</w:t>
+            <w:r>
+              <w:t>1</w:t>
             </w:r>
             <w:r>
               <w:t>9</w:t>
@@ -1050,7 +1089,7 @@
               <w:t xml:space="preserve"> </w:t>
             </w:r>
             <w:r>
-              <w:t>18</w:t>
+              <w:t>22</w:t>
             </w:r>
             <w:r>
               <w:t>/09/2026</w:t>
@@ -1097,7 +1136,10 @@
               <w:t>Nhân viên giám sát trung tâm</w:t>
             </w:r>
             <w:r>
-              <w:t xml:space="preserve"> (Hub Operator).</w:t>
+              <w:t xml:space="preserve"> (Hub </w:t>
+            </w:r>
+            <w:r>
+              <w:t>Operator).</w:t>
             </w:r>
           </w:p>
           <w:p>
@@ -1109,16 +1151,19 @@
               <w:t>Secondary:</w:t>
             </w:r>
             <w:r>
-              <w:t xml:space="preserve"> </w:t>
-            </w:r>
-            <w:r>
-              <w:t xml:space="preserve">Hệ thống xử lý Logic (Multi-level alert logic), Phân hệ </w:t>
+              <w:t xml:space="preserve"> Hệ thống xử lý Logic (Multi-level alert logic), Phân hệ </w:t>
             </w:r>
             <w:r>
               <w:t>đ</w:t>
             </w:r>
             <w:r>
-              <w:t>ặt xe (SS1/SS2).</w:t>
+              <w:t>ặt xe (SS1/SS2)</w:t>
+            </w:r>
+            <w:r>
+              <w:t xml:space="preserve">, Phân hệ </w:t>
+            </w:r>
+            <w:r>
+              <w:t>SS4.</w:t>
             </w:r>
           </w:p>
         </w:tc>
@@ -1164,6 +1209,7 @@
           </w:tcPr>
           <w:p>
             <w:r>
+              <w:lastRenderedPageBreak/>
               <w:t>Trigger:</w:t>
             </w:r>
           </w:p>
@@ -1243,7 +1289,6 @@
               </w:rPr>
             </w:pPr>
             <w:r>
-              <w:lastRenderedPageBreak/>
               <w:t>Postconditions:</w:t>
             </w:r>
           </w:p>
@@ -1263,13 +1308,7 @@
           </w:p>
           <w:p>
             <w:r>
-              <w:t xml:space="preserve">2. Đối với ngưỡng </w:t>
-            </w:r>
-            <w:r>
-              <w:t>100</w:t>
-            </w:r>
-            <w:r>
-              <w:t>%, Hub bị khóa tính năng nhận đặt chỗ/đặt xe thành công, đồng bộ dữ liệu chặn với phân hệ SS1/SS2.</w:t>
+              <w:t>2. Đối với ngưỡng 100%, Hub bị khóa tính năng nhận đặt chỗ/đặt xe thành công, đồng bộ dữ liệu chặn với phân hệ SS1/SS2.</w:t>
             </w:r>
           </w:p>
         </w:tc>
@@ -1428,7 +1467,19 @@
               <w:t>Màu đỏ nhấp nháy</w:t>
             </w:r>
             <w:r>
-              <w:t xml:space="preserve"> và đẩy pop-up/âm thanh cảnh báo khẩn cấp. Operator nhấp xác nhận cảnh báo để tiến hành quy trình Điều phối (chuyển sang SS4).</w:t>
+              <w:t xml:space="preserve"> và đẩy pop-up/âm thanh cảnh báo khẩn cấp. </w:t>
+            </w:r>
+            <w:r>
+              <w:t xml:space="preserve">Cùng lúc đó, hệ thống tự động gửi đề xuất lệnh điều xe sang phân hệ </w:t>
+            </w:r>
+            <w:r>
+              <w:t xml:space="preserve">SS4 (theo uc_ss4_01). </w:t>
+            </w:r>
+            <w:r>
+              <w:t xml:space="preserve">Operator nhấp xác nhận cảnh báo để tiến hành quy trình Điều </w:t>
+            </w:r>
+            <w:r>
+              <w:t>phối (chuyển sang SS4).</w:t>
             </w:r>
           </w:p>
           <w:p>
@@ -1467,14 +1518,7 @@
                 <w:b/>
                 <w:bCs/>
               </w:rPr>
-              <w:t>Khóa Đỏ</w:t>
-            </w:r>
-            <w:r>
-              <w:rPr>
-                <w:b/>
-                <w:bCs/>
-              </w:rPr>
-              <w:t xml:space="preserve"> khẩn cấp</w:t>
+              <w:t>Khóa Đỏ khẩn cấp</w:t>
             </w:r>
             <w:r>
               <w:t xml:space="preserve"> hiển thị trên Dashboard, đồng thời từ chối mọi truy vấn đặt chỗ mới từ phía Sinh viên (SS1/SS2)</w:t>
@@ -1612,6 +1656,56 @@
 </w:document>
 </file>
 
+<file path=word/endnotes.xml><?xml version="1.0" encoding="utf-8"?>
+<w:endnotes xmlns:wpc="http://schemas.microsoft.com/office/word/2010/wordprocessingCanvas" xmlns:cx="http://schemas.microsoft.com/office/drawing/2014/chartex" xmlns:cx1="http://schemas.microsoft.com/office/drawing/2015/9/8/chartex" xmlns:cx2="http://schemas.microsoft.com/office/drawing/2015/10/21/chartex" xmlns:cx3="http://schemas.microsoft.com/office/drawing/2016/5/9/chartex" xmlns:cx4="http://schemas.microsoft.com/office/drawing/2016/5/10/chartex" xmlns:cx5="http://schemas.microsoft.com/office/drawing/2016/5/11/chartex" xmlns:cx6="http://schemas.microsoft.com/office/drawing/2016/5/12/chartex" xmlns:cx7="http://schemas.microsoft.com/office/drawing/2016/5/13/chartex" xmlns:cx8="http://schemas.microsoft.com/office/drawing/2016/5/14/chartex" xmlns:mc="http://schemas.openxmlformats.org/markup-compatibility/2006" xmlns:aink="http://schemas.microsoft.com/office/drawing/2016/ink" xmlns:am3d="http://schemas.microsoft.com/office/drawing/2017/model3d" xmlns:o="urn:schemas-microsoft-com:office:office" xmlns:oel="http://schemas.microsoft.com/office/2019/extlst" xmlns:r="http://schemas.openxmlformats.org/officeDocument/2006/relationships" xmlns:m="http://schemas.openxmlformats.org/officeDocument/2006/math" xmlns:v="urn:schemas-microsoft-com:vml" xmlns:wp14="http://schemas.microsoft.com/office/word/2010/wordprocessingDrawing" xmlns:wp="http://schemas.openxmlformats.org/drawingml/2006/wordprocessingDrawing" xmlns:w10="urn:schemas-microsoft-com:office:word" xmlns:w="http://schemas.openxmlformats.org/wordprocessingml/2006/main" xmlns:w14="http://schemas.microsoft.com/office/word/2010/wordml" xmlns:w15="http://schemas.microsoft.com/office/word/2012/wordml" xmlns:w16cex="http://schemas.microsoft.com/office/word/2018/wordml/cex" xmlns:w16cid="http://schemas.microsoft.com/office/word/2016/wordml/cid" xmlns:w16="http://schemas.microsoft.com/office/word/2018/wordml" xmlns:w16du="http://schemas.microsoft.com/office/word/2023/wordml/word16du" xmlns:w16sdtdh="http://schemas.microsoft.com/office/word/2020/wordml/sdtdatahash" xmlns:w16sdtfl="http://schemas.microsoft.com/office/word/2024/wordml/sdtformatlock" xmlns:w16se="http://schemas.microsoft.com/office/word/2015/wordml/symex" xmlns:wpg="http://schemas.microsoft.com/office/word/2010/wordprocessingGroup" xmlns:wpi="http://schemas.microsoft.com/office/word/2010/wordprocessingInk" xmlns:wne="http://schemas.microsoft.com/office/word/2006/wordml" xmlns:wps="http://schemas.microsoft.com/office/word/2010/wordprocessingShape" mc:Ignorable="w14 w15 w16se w16cid w16 w16cex w16sdtdh w16sdtfl w16du wp14">
+  <w:endnote w:type="separator" w:id="-1">
+    <w:p>
+      <w:pPr>
+        <w:spacing w:after="0" w:line="240" w:lineRule="auto"/>
+      </w:pPr>
+      <w:r>
+        <w:separator/>
+      </w:r>
+    </w:p>
+  </w:endnote>
+  <w:endnote w:type="continuationSeparator" w:id="0">
+    <w:p>
+      <w:pPr>
+        <w:spacing w:after="0" w:line="240" w:lineRule="auto"/>
+      </w:pPr>
+      <w:r>
+        <w:continuationSeparator/>
+      </w:r>
+    </w:p>
+  </w:endnote>
+</w:endnotes>
+</file>
+
+<file path=word/footnotes.xml><?xml version="1.0" encoding="utf-8"?>
+<w:footnotes xmlns:wpc="http://schemas.microsoft.com/office/word/2010/wordprocessingCanvas" xmlns:cx="http://schemas.microsoft.com/office/drawing/2014/chartex" xmlns:cx1="http://schemas.microsoft.com/office/drawing/2015/9/8/chartex" xmlns:cx2="http://schemas.microsoft.com/office/drawing/2015/10/21/chartex" xmlns:cx3="http://schemas.microsoft.com/office/drawing/2016/5/9/chartex" xmlns:cx4="http://schemas.microsoft.com/office/drawing/2016/5/10/chartex" xmlns:cx5="http://schemas.microsoft.com/office/drawing/2016/5/11/chartex" xmlns:cx6="http://schemas.microsoft.com/office/drawing/2016/5/12/chartex" xmlns:cx7="http://schemas.microsoft.com/office/drawing/2016/5/13/chartex" xmlns:cx8="http://schemas.microsoft.com/office/drawing/2016/5/14/chartex" xmlns:mc="http://schemas.openxmlformats.org/markup-compatibility/2006" xmlns:aink="http://schemas.microsoft.com/office/drawing/2016/ink" xmlns:am3d="http://schemas.microsoft.com/office/drawing/2017/model3d" xmlns:o="urn:schemas-microsoft-com:office:office" xmlns:oel="http://schemas.microsoft.com/office/2019/extlst" xmlns:r="http://schemas.openxmlformats.org/officeDocument/2006/relationships" xmlns:m="http://schemas.openxmlformats.org/officeDocument/2006/math" xmlns:v="urn:schemas-microsoft-com:vml" xmlns:wp14="http://schemas.microsoft.com/office/word/2010/wordprocessingDrawing" xmlns:wp="http://schemas.openxmlformats.org/drawingml/2006/wordprocessingDrawing" xmlns:w10="urn:schemas-microsoft-com:office:word" xmlns:w="http://schemas.openxmlformats.org/wordprocessingml/2006/main" xmlns:w14="http://schemas.microsoft.com/office/word/2010/wordml" xmlns:w15="http://schemas.microsoft.com/office/word/2012/wordml" xmlns:w16cex="http://schemas.microsoft.com/office/word/2018/wordml/cex" xmlns:w16cid="http://schemas.microsoft.com/office/word/2016/wordml/cid" xmlns:w16="http://schemas.microsoft.com/office/word/2018/wordml" xmlns:w16du="http://schemas.microsoft.com/office/word/2023/wordml/word16du" xmlns:w16sdtdh="http://schemas.microsoft.com/office/word/2020/wordml/sdtdatahash" xmlns:w16sdtfl="http://schemas.microsoft.com/office/word/2024/wordml/sdtformatlock" xmlns:w16se="http://schemas.microsoft.com/office/word/2015/wordml/symex" xmlns:wpg="http://schemas.microsoft.com/office/word/2010/wordprocessingGroup" xmlns:wpi="http://schemas.microsoft.com/office/word/2010/wordprocessingInk" xmlns:wne="http://schemas.microsoft.com/office/word/2006/wordml" xmlns:wps="http://schemas.microsoft.com/office/word/2010/wordprocessingShape" mc:Ignorable="w14 w15 w16se w16cid w16 w16cex w16sdtdh w16sdtfl w16du wp14">
+  <w:footnote w:type="separator" w:id="-1">
+    <w:p>
+      <w:pPr>
+        <w:spacing w:after="0" w:line="240" w:lineRule="auto"/>
+      </w:pPr>
+      <w:r>
+        <w:separator/>
+      </w:r>
+    </w:p>
+  </w:footnote>
+  <w:footnote w:type="continuationSeparator" w:id="0">
+    <w:p>
+      <w:pPr>
+        <w:spacing w:after="0" w:line="240" w:lineRule="auto"/>
+      </w:pPr>
+      <w:r>
+        <w:continuationSeparator/>
+      </w:r>
+    </w:p>
+  </w:footnote>
+</w:footnotes>
+</file>
+
 <file path=word/numbering.xml><?xml version="1.0" encoding="utf-8"?>
 <w:numbering xmlns:wpc="http://schemas.microsoft.com/office/word/2010/wordprocessingCanvas" xmlns:cx="http://schemas.microsoft.com/office/drawing/2014/chartex" xmlns:cx1="http://schemas.microsoft.com/office/drawing/2015/9/8/chartex" xmlns:cx2="http://schemas.microsoft.com/office/drawing/2015/10/21/chartex" xmlns:cx3="http://schemas.microsoft.com/office/drawing/2016/5/9/chartex" xmlns:cx4="http://schemas.microsoft.com/office/drawing/2016/5/10/chartex" xmlns:cx5="http://schemas.microsoft.com/office/drawing/2016/5/11/chartex" xmlns:cx6="http://schemas.microsoft.com/office/drawing/2016/5/12/chartex" xmlns:cx7="http://schemas.microsoft.com/office/drawing/2016/5/13/chartex" xmlns:cx8="http://schemas.microsoft.com/office/drawing/2016/5/14/chartex" xmlns:mc="http://schemas.openxmlformats.org/markup-compatibility/2006" xmlns:aink="http://schemas.microsoft.com/office/drawing/2016/ink" xmlns:am3d="http://schemas.microsoft.com/office/drawing/2017/model3d" xmlns:o="urn:schemas-microsoft-com:office:office" xmlns:oel="http://schemas.microsoft.com/office/2019/extlst" xmlns:r="http://schemas.openxmlformats.org/officeDocument/2006/relationships" xmlns:m="http://schemas.openxmlformats.org/officeDocument/2006/math" xmlns:v="urn:schemas-microsoft-com:vml" xmlns:wp14="http://schemas.microsoft.com/office/word/2010/wordprocessingDrawing" xmlns:wp="http://schemas.openxmlformats.org/drawingml/2006/wordprocessingDrawing" xmlns:w10="urn:schemas-microsoft-com:office:word" xmlns:w="http://schemas.openxmlformats.org/wordprocessingml/2006/main" xmlns:w14="http://schemas.microsoft.com/office/word/2010/wordml" xmlns:w15="http://schemas.microsoft.com/office/word/2012/wordml" xmlns:w16cex="http://schemas.microsoft.com/office/word/2018/wordml/cex" xmlns:w16cid="http://schemas.microsoft.com/office/word/2016/wordml/cid" xmlns:w16="http://schemas.microsoft.com/office/word/2018/wordml" xmlns:w16du="http://schemas.microsoft.com/office/word/2023/wordml/word16du" xmlns:w16sdtdh="http://schemas.microsoft.com/office/word/2020/wordml/sdtdatahash" xmlns:w16sdtfl="http://schemas.microsoft.com/office/word/2024/wordml/sdtformatlock" xmlns:w16se="http://schemas.microsoft.com/office/word/2015/wordml/symex" xmlns:wpg="http://schemas.microsoft.com/office/word/2010/wordprocessingGroup" xmlns:wpi="http://schemas.microsoft.com/office/word/2010/wordprocessingInk" xmlns:wne="http://schemas.microsoft.com/office/word/2006/wordml" xmlns:wps="http://schemas.microsoft.com/office/word/2010/wordprocessingShape" mc:Ignorable="w14 w15 w16se w16cid w16 w16cex w16sdtdh w16sdtfl w16du wp14">
   <w:abstractNum w:abstractNumId="0" w15:restartNumberingAfterBreak="0">
@@ -1913,6 +2007,95 @@
     </w:lvl>
   </w:abstractNum>
   <w:abstractNum w:abstractNumId="2" w15:restartNumberingAfterBreak="0">
+    <w:nsid w:val="3F624AAB"/>
+    <w:multiLevelType w:val="hybridMultilevel"/>
+    <w:tmpl w:val="B2D07730"/>
+    <w:lvl w:ilvl="0" w:tplc="CC1A7ED6">
+      <w:start w:val="1"/>
+      <w:numFmt w:val="decimal"/>
+      <w:lvlText w:val="%1."/>
+      <w:lvlJc w:val="left"/>
+      <w:pPr>
+        <w:ind w:left="720" w:hanging="360"/>
+      </w:pPr>
+      <w:rPr>
+        <w:rFonts w:asciiTheme="minorHAnsi" w:eastAsiaTheme="minorHAnsi" w:hAnsiTheme="minorHAnsi" w:cstheme="minorBidi"/>
+      </w:rPr>
+    </w:lvl>
+    <w:lvl w:ilvl="1" w:tplc="04090019" w:tentative="1">
+      <w:start w:val="1"/>
+      <w:numFmt w:val="lowerLetter"/>
+      <w:lvlText w:val="%2."/>
+      <w:lvlJc w:val="left"/>
+      <w:pPr>
+        <w:ind w:left="1440" w:hanging="360"/>
+      </w:pPr>
+    </w:lvl>
+    <w:lvl w:ilvl="2" w:tplc="0409001B" w:tentative="1">
+      <w:start w:val="1"/>
+      <w:numFmt w:val="lowerRoman"/>
+      <w:lvlText w:val="%3."/>
+      <w:lvlJc w:val="right"/>
+      <w:pPr>
+        <w:ind w:left="2160" w:hanging="180"/>
+      </w:pPr>
+    </w:lvl>
+    <w:lvl w:ilvl="3" w:tplc="0409000F" w:tentative="1">
+      <w:start w:val="1"/>
+      <w:numFmt w:val="decimal"/>
+      <w:lvlText w:val="%4."/>
+      <w:lvlJc w:val="left"/>
+      <w:pPr>
+        <w:ind w:left="2880" w:hanging="360"/>
+      </w:pPr>
+    </w:lvl>
+    <w:lvl w:ilvl="4" w:tplc="04090019" w:tentative="1">
+      <w:start w:val="1"/>
+      <w:numFmt w:val="lowerLetter"/>
+      <w:lvlText w:val="%5."/>
+      <w:lvlJc w:val="left"/>
+      <w:pPr>
+        <w:ind w:left="3600" w:hanging="360"/>
+      </w:pPr>
+    </w:lvl>
+    <w:lvl w:ilvl="5" w:tplc="0409001B" w:tentative="1">
+      <w:start w:val="1"/>
+      <w:numFmt w:val="lowerRoman"/>
+      <w:lvlText w:val="%6."/>
+      <w:lvlJc w:val="right"/>
+      <w:pPr>
+        <w:ind w:left="4320" w:hanging="180"/>
+      </w:pPr>
+    </w:lvl>
+    <w:lvl w:ilvl="6" w:tplc="0409000F" w:tentative="1">
+      <w:start w:val="1"/>
+      <w:numFmt w:val="decimal"/>
+      <w:lvlText w:val="%7."/>
+      <w:lvlJc w:val="left"/>
+      <w:pPr>
+        <w:ind w:left="5040" w:hanging="360"/>
+      </w:pPr>
+    </w:lvl>
+    <w:lvl w:ilvl="7" w:tplc="04090019" w:tentative="1">
+      <w:start w:val="1"/>
+      <w:numFmt w:val="lowerLetter"/>
+      <w:lvlText w:val="%8."/>
+      <w:lvlJc w:val="left"/>
+      <w:pPr>
+        <w:ind w:left="5760" w:hanging="360"/>
+      </w:pPr>
+    </w:lvl>
+    <w:lvl w:ilvl="8" w:tplc="0409001B" w:tentative="1">
+      <w:start w:val="1"/>
+      <w:numFmt w:val="lowerRoman"/>
+      <w:lvlText w:val="%9."/>
+      <w:lvlJc w:val="right"/>
+      <w:pPr>
+        <w:ind w:left="6480" w:hanging="180"/>
+      </w:pPr>
+    </w:lvl>
+  </w:abstractNum>
+  <w:abstractNum w:abstractNumId="3" w15:restartNumberingAfterBreak="0">
     <w:nsid w:val="43E26F8F"/>
     <w:multiLevelType w:val="multilevel"/>
     <w:tmpl w:val="0E80873A"/>
@@ -2061,7 +2244,7 @@
       </w:rPr>
     </w:lvl>
   </w:abstractNum>
-  <w:abstractNum w:abstractNumId="3" w15:restartNumberingAfterBreak="0">
+  <w:abstractNum w:abstractNumId="4" w15:restartNumberingAfterBreak="0">
     <w:nsid w:val="45C71845"/>
     <w:multiLevelType w:val="multilevel"/>
     <w:tmpl w:val="4B30DCF2"/>
@@ -2206,7 +2389,7 @@
       </w:rPr>
     </w:lvl>
   </w:abstractNum>
-  <w:abstractNum w:abstractNumId="4" w15:restartNumberingAfterBreak="0">
+  <w:abstractNum w:abstractNumId="5" w15:restartNumberingAfterBreak="0">
     <w:nsid w:val="50290B74"/>
     <w:multiLevelType w:val="multilevel"/>
     <w:tmpl w:val="3C4A377C"/>
@@ -2355,7 +2538,7 @@
       </w:rPr>
     </w:lvl>
   </w:abstractNum>
-  <w:abstractNum w:abstractNumId="5" w15:restartNumberingAfterBreak="0">
+  <w:abstractNum w:abstractNumId="6" w15:restartNumberingAfterBreak="0">
     <w:nsid w:val="64F41F80"/>
     <w:multiLevelType w:val="multilevel"/>
     <w:tmpl w:val="3ED29316"/>
@@ -2504,7 +2687,7 @@
       </w:rPr>
     </w:lvl>
   </w:abstractNum>
-  <w:abstractNum w:abstractNumId="6" w15:restartNumberingAfterBreak="0">
+  <w:abstractNum w:abstractNumId="7" w15:restartNumberingAfterBreak="0">
     <w:nsid w:val="698C640B"/>
     <w:multiLevelType w:val="multilevel"/>
     <w:tmpl w:val="A5040CA8"/>
@@ -2657,22 +2840,25 @@
     <w:abstractNumId w:val="0"/>
   </w:num>
   <w:num w:numId="2" w16cid:durableId="678242697">
-    <w:abstractNumId w:val="2"/>
+    <w:abstractNumId w:val="3"/>
   </w:num>
   <w:num w:numId="3" w16cid:durableId="1912538591">
     <w:abstractNumId w:val="1"/>
   </w:num>
   <w:num w:numId="4" w16cid:durableId="1661615673">
+    <w:abstractNumId w:val="7"/>
+  </w:num>
+  <w:num w:numId="5" w16cid:durableId="45883181">
+    <w:abstractNumId w:val="5"/>
+  </w:num>
+  <w:num w:numId="6" w16cid:durableId="979305807">
+    <w:abstractNumId w:val="4"/>
+  </w:num>
+  <w:num w:numId="7" w16cid:durableId="613709371">
     <w:abstractNumId w:val="6"/>
   </w:num>
-  <w:num w:numId="5" w16cid:durableId="45883181">
-    <w:abstractNumId w:val="4"/>
-  </w:num>
-  <w:num w:numId="6" w16cid:durableId="979305807">
-    <w:abstractNumId w:val="3"/>
-  </w:num>
-  <w:num w:numId="7" w16cid:durableId="613709371">
-    <w:abstractNumId w:val="5"/>
+  <w:num w:numId="8" w16cid:durableId="985471664">
+    <w:abstractNumId w:val="2"/>
   </w:num>
 </w:numbering>
 </file>
@@ -3289,6 +3475,7 @@
   <w:style w:type="character" w:default="1" w:styleId="DefaultParagraphFont">
     <w:name w:val="Default Paragraph Font"/>
     <w:uiPriority w:val="1"/>
+    <w:semiHidden/>
     <w:unhideWhenUsed/>
   </w:style>
   <w:style w:type="table" w:default="1" w:styleId="TableNormal">
@@ -3678,6 +3865,62 @@
       <w14:ligatures w14:val="none"/>
     </w:rPr>
   </w:style>
+  <w:style w:type="paragraph" w:styleId="Header">
+    <w:name w:val="header"/>
+    <w:basedOn w:val="Normal"/>
+    <w:link w:val="HeaderChar"/>
+    <w:uiPriority w:val="99"/>
+    <w:unhideWhenUsed/>
+    <w:rsid w:val="00D614FD"/>
+    <w:pPr>
+      <w:tabs>
+        <w:tab w:val="center" w:pos="4680"/>
+        <w:tab w:val="right" w:pos="9360"/>
+      </w:tabs>
+      <w:spacing w:after="0" w:line="240" w:lineRule="auto"/>
+    </w:pPr>
+  </w:style>
+  <w:style w:type="character" w:customStyle="1" w:styleId="HeaderChar">
+    <w:name w:val="Header Char"/>
+    <w:basedOn w:val="DefaultParagraphFont"/>
+    <w:link w:val="Header"/>
+    <w:uiPriority w:val="99"/>
+    <w:rsid w:val="00D614FD"/>
+    <w:rPr>
+      <w:rFonts w:eastAsiaTheme="minorHAnsi"/>
+      <w:sz w:val="22"/>
+      <w:szCs w:val="22"/>
+      <w:lang w:val="vi-VN" w:eastAsia="en-US"/>
+    </w:rPr>
+  </w:style>
+  <w:style w:type="paragraph" w:styleId="Footer">
+    <w:name w:val="footer"/>
+    <w:basedOn w:val="Normal"/>
+    <w:link w:val="FooterChar"/>
+    <w:uiPriority w:val="99"/>
+    <w:unhideWhenUsed/>
+    <w:rsid w:val="00D614FD"/>
+    <w:pPr>
+      <w:tabs>
+        <w:tab w:val="center" w:pos="4680"/>
+        <w:tab w:val="right" w:pos="9360"/>
+      </w:tabs>
+      <w:spacing w:after="0" w:line="240" w:lineRule="auto"/>
+    </w:pPr>
+  </w:style>
+  <w:style w:type="character" w:customStyle="1" w:styleId="FooterChar">
+    <w:name w:val="Footer Char"/>
+    <w:basedOn w:val="DefaultParagraphFont"/>
+    <w:link w:val="Footer"/>
+    <w:uiPriority w:val="99"/>
+    <w:rsid w:val="00D614FD"/>
+    <w:rPr>
+      <w:rFonts w:eastAsiaTheme="minorHAnsi"/>
+      <w:sz w:val="22"/>
+      <w:szCs w:val="22"/>
+      <w:lang w:val="vi-VN" w:eastAsia="en-US"/>
+    </w:rPr>
+  </w:style>
 </w:styles>
 </file>
 

</xml_diff>